<commit_message>
class diagram sdd'ye eklendi
</commit_message>
<xml_diff>
--- a/Docs/8-11-2025-Sprint3/IEEE_SDD v1.0.docx
+++ b/Docs/8-11-2025-Sprint3/IEEE_SDD v1.0.docx
@@ -31,12 +31,12 @@
           <wp:inline distB="0" distT="0" distL="0" distR="0">
             <wp:extent cx="1473835" cy="407670"/>
             <wp:effectExtent b="0" l="0" r="0" t="0"/>
-            <wp:docPr id="12" name="image1.png"/>
+            <wp:docPr id="7" name="image3.png"/>
             <a:graphic>
               <a:graphicData uri="http://schemas.openxmlformats.org/drawingml/2006/picture">
                 <pic:pic>
                   <pic:nvPicPr>
-                    <pic:cNvPr id="0" name="image1.png"/>
+                    <pic:cNvPr id="0" name="image3.png"/>
                     <pic:cNvPicPr preferRelativeResize="0"/>
                   </pic:nvPicPr>
                   <pic:blipFill>
@@ -1314,7 +1314,7 @@
     </w:p>
     <w:sdt>
       <w:sdtPr>
-        <w:id w:val="846149799"/>
+        <w:id w:val="-131289441"/>
         <w:docPartObj>
           <w:docPartGallery w:val="Table of Contents"/>
           <w:docPartUnique w:val="1"/>
@@ -2265,7 +2265,7 @@
       </w:pPr>
       <w:sdt>
         <w:sdtPr>
-          <w:id w:val="1028211402"/>
+          <w:id w:val="1909762570"/>
           <w:tag w:val="goog_rdk_0"/>
         </w:sdtPr>
         <w:sdtContent>
@@ -3466,7 +3466,7 @@
       <w:bookmarkEnd w:id="21"/>
       <w:sdt>
         <w:sdtPr>
-          <w:id w:val="1147191461"/>
+          <w:id w:val="-1028853750"/>
           <w:tag w:val="goog_rdk_1"/>
         </w:sdtPr>
         <w:sdtContent>
@@ -3600,7 +3600,7 @@
       <w:bookmarkEnd w:id="22"/>
       <w:sdt>
         <w:sdtPr>
-          <w:id w:val="-1961422413"/>
+          <w:id w:val="-1061286909"/>
           <w:tag w:val="goog_rdk_2"/>
         </w:sdtPr>
         <w:sdtContent>
@@ -3734,7 +3734,7 @@
       <w:bookmarkEnd w:id="23"/>
       <w:sdt>
         <w:sdtPr>
-          <w:id w:val="1443870292"/>
+          <w:id w:val="-591344583"/>
           <w:tag w:val="goog_rdk_3"/>
         </w:sdtPr>
         <w:sdtContent>
@@ -3868,7 +3868,7 @@
       <w:bookmarkEnd w:id="24"/>
       <w:sdt>
         <w:sdtPr>
-          <w:id w:val="-1295307038"/>
+          <w:id w:val="-847090111"/>
           <w:tag w:val="goog_rdk_4"/>
         </w:sdtPr>
         <w:sdtContent>
@@ -4002,7 +4002,7 @@
       <w:bookmarkEnd w:id="25"/>
       <w:sdt>
         <w:sdtPr>
-          <w:id w:val="-2145664797"/>
+          <w:id w:val="-1676501971"/>
           <w:tag w:val="goog_rdk_5"/>
         </w:sdtPr>
         <w:sdtContent>
@@ -4136,7 +4136,7 @@
       <w:bookmarkEnd w:id="26"/>
       <w:sdt>
         <w:sdtPr>
-          <w:id w:val="616710215"/>
+          <w:id w:val="1267849160"/>
           <w:tag w:val="goog_rdk_6"/>
         </w:sdtPr>
         <w:sdtContent>
@@ -4270,7 +4270,7 @@
       <w:bookmarkEnd w:id="27"/>
       <w:sdt>
         <w:sdtPr>
-          <w:id w:val="-645350668"/>
+          <w:id w:val="741933205"/>
           <w:tag w:val="goog_rdk_7"/>
         </w:sdtPr>
         <w:sdtContent>
@@ -4410,7 +4410,7 @@
       <w:bookmarkEnd w:id="28"/>
       <w:sdt>
         <w:sdtPr>
-          <w:id w:val="749546929"/>
+          <w:id w:val="947799986"/>
           <w:tag w:val="goog_rdk_8"/>
         </w:sdtPr>
         <w:sdtContent>
@@ -4550,7 +4550,7 @@
       <w:bookmarkEnd w:id="29"/>
       <w:sdt>
         <w:sdtPr>
-          <w:id w:val="711892787"/>
+          <w:id w:val="-1902362780"/>
           <w:tag w:val="goog_rdk_9"/>
         </w:sdtPr>
         <w:sdtContent>
@@ -4652,7 +4652,7 @@
       </w:r>
       <w:sdt>
         <w:sdtPr>
-          <w:id w:val="-2038769814"/>
+          <w:id w:val="1715724444"/>
           <w:tag w:val="goog_rdk_10"/>
         </w:sdtPr>
         <w:sdtContent>
@@ -4692,7 +4692,7 @@
       <w:bookmarkEnd w:id="30"/>
       <w:sdt>
         <w:sdtPr>
-          <w:id w:val="948359517"/>
+          <w:id w:val="-1890436291"/>
           <w:tag w:val="goog_rdk_11"/>
         </w:sdtPr>
         <w:sdtContent>
@@ -4826,7 +4826,7 @@
       <w:bookmarkEnd w:id="31"/>
       <w:sdt>
         <w:sdtPr>
-          <w:id w:val="-325272365"/>
+          <w:id w:val="-1733135637"/>
           <w:tag w:val="goog_rdk_12"/>
         </w:sdtPr>
         <w:sdtContent>
@@ -4960,7 +4960,7 @@
       <w:bookmarkEnd w:id="32"/>
       <w:sdt>
         <w:sdtPr>
-          <w:id w:val="-548850396"/>
+          <w:id w:val="-1741071974"/>
           <w:tag w:val="goog_rdk_13"/>
         </w:sdtPr>
         <w:sdtContent>
@@ -5127,6 +5127,60 @@
     </w:p>
     <w:p>
       <w:pPr>
+        <w:rPr>
+          <w:rFonts w:ascii="Times New Roman" w:cs="Times New Roman" w:eastAsia="Times New Roman" w:hAnsi="Times New Roman"/>
+          <w:sz w:val="24"/>
+          <w:szCs w:val="24"/>
+        </w:rPr>
+      </w:pPr>
+      <w:r>
+        <w:rPr>
+          <w:rFonts w:ascii="Times New Roman" w:cs="Times New Roman" w:eastAsia="Times New Roman" w:hAnsi="Times New Roman"/>
+          <w:sz w:val="24"/>
+          <w:szCs w:val="24"/>
+          <w:rtl w:val="0"/>
+        </w:rPr>
+        <w:t xml:space="preserve">In addition, the class diagram can be accessed via the file below:</w:t>
+      </w:r>
+    </w:p>
+    <w:p>
+      <w:pPr>
+        <w:rPr>
+          <w:rFonts w:ascii="Times New Roman" w:cs="Times New Roman" w:eastAsia="Times New Roman" w:hAnsi="Times New Roman"/>
+          <w:sz w:val="24"/>
+          <w:szCs w:val="24"/>
+        </w:rPr>
+      </w:pPr>
+      <w:r>
+        <w:rPr>
+          <w:rFonts w:ascii="Times New Roman" w:cs="Times New Roman" w:eastAsia="Times New Roman" w:hAnsi="Times New Roman"/>
+          <w:sz w:val="24"/>
+          <w:szCs w:val="24"/>
+          <w:rtl w:val="0"/>
+        </w:rPr>
+        <w:tab/>
+      </w:r>
+      <w:hyperlink r:id="rId11">
+        <w:r>
+          <w:rPr>
+            <w:rFonts w:ascii="Times New Roman" w:cs="Times New Roman" w:eastAsia="Times New Roman" w:hAnsi="Times New Roman"/>
+            <w:color w:val="0000ee"/>
+            <w:sz w:val="24"/>
+            <w:szCs w:val="24"/>
+            <w:u w:val="single"/>
+            <w:rtl w:val="0"/>
+          </w:rPr>
+          <w:t xml:space="preserve">Class Diagram.png</w:t>
+        </w:r>
+      </w:hyperlink>
+      <w:r>
+        <w:rPr>
+          <w:rtl w:val="0"/>
+        </w:rPr>
+      </w:r>
+    </w:p>
+    <w:p>
+      <w:pPr>
         <w:pStyle w:val="Heading3"/>
         <w:keepNext w:val="0"/>
         <w:keepLines w:val="0"/>
@@ -6462,7 +6516,7 @@
       <w:pPr>
         <w:rPr/>
       </w:pPr>
-      <w:hyperlink r:id="rId11">
+      <w:hyperlink r:id="rId12">
         <w:r>
           <w:rPr>
             <w:color w:val="1155cc"/>
@@ -6504,16 +6558,16 @@
             <wp:extent cx="3425981" cy="3535437"/>
             <wp:effectExtent b="0" l="0" r="0" t="0"/>
             <wp:wrapSquare wrapText="bothSides" distB="114300" distT="114300" distL="114300" distR="114300"/>
-            <wp:docPr id="11" name="image3.png"/>
+            <wp:docPr id="12" name="image5.png"/>
             <a:graphic>
               <a:graphicData uri="http://schemas.openxmlformats.org/drawingml/2006/picture">
                 <pic:pic>
                   <pic:nvPicPr>
-                    <pic:cNvPr id="0" name="image3.png"/>
+                    <pic:cNvPr id="0" name="image5.png"/>
                     <pic:cNvPicPr preferRelativeResize="0"/>
                   </pic:nvPicPr>
                   <pic:blipFill>
-                    <a:blip r:embed="rId12"/>
+                    <a:blip r:embed="rId13"/>
                     <a:srcRect b="0" l="0" r="0" t="0"/>
                     <a:stretch>
                       <a:fillRect/>
@@ -6546,16 +6600,16 @@
             <wp:extent cx="2146752" cy="4917345"/>
             <wp:effectExtent b="0" l="0" r="0" t="0"/>
             <wp:wrapSquare wrapText="bothSides" distB="114300" distT="114300" distL="114300" distR="114300"/>
-            <wp:docPr id="10" name="image2.png"/>
+            <wp:docPr id="11" name="image6.png"/>
             <a:graphic>
               <a:graphicData uri="http://schemas.openxmlformats.org/drawingml/2006/picture">
                 <pic:pic>
                   <pic:nvPicPr>
-                    <pic:cNvPr id="0" name="image2.png"/>
+                    <pic:cNvPr id="0" name="image6.png"/>
                     <pic:cNvPicPr preferRelativeResize="0"/>
                   </pic:nvPicPr>
                   <pic:blipFill>
-                    <a:blip r:embed="rId13"/>
+                    <a:blip r:embed="rId14"/>
                     <a:srcRect b="0" l="0" r="0" t="0"/>
                     <a:stretch>
                       <a:fillRect/>
@@ -6605,16 +6659,16 @@
             <wp:extent cx="2900363" cy="5427988"/>
             <wp:effectExtent b="0" l="0" r="0" t="0"/>
             <wp:wrapSquare wrapText="bothSides" distB="114300" distT="114300" distL="114300" distR="114300"/>
-            <wp:docPr id="8" name="image4.png"/>
+            <wp:docPr id="9" name="image2.png"/>
             <a:graphic>
               <a:graphicData uri="http://schemas.openxmlformats.org/drawingml/2006/picture">
                 <pic:pic>
                   <pic:nvPicPr>
-                    <pic:cNvPr id="0" name="image4.png"/>
+                    <pic:cNvPr id="0" name="image2.png"/>
                     <pic:cNvPicPr preferRelativeResize="0"/>
                   </pic:nvPicPr>
                   <pic:blipFill>
-                    <a:blip r:embed="rId14"/>
+                    <a:blip r:embed="rId15"/>
                     <a:srcRect b="0" l="0" r="0" t="0"/>
                     <a:stretch>
                       <a:fillRect/>
@@ -6647,16 +6701,16 @@
             <wp:extent cx="2709863" cy="6159768"/>
             <wp:effectExtent b="0" l="0" r="0" t="0"/>
             <wp:wrapSquare wrapText="bothSides" distB="114300" distT="114300" distL="114300" distR="114300"/>
-            <wp:docPr id="7" name="image5.png"/>
+            <wp:docPr id="8" name="image1.png"/>
             <a:graphic>
               <a:graphicData uri="http://schemas.openxmlformats.org/drawingml/2006/picture">
                 <pic:pic>
                   <pic:nvPicPr>
-                    <pic:cNvPr id="0" name="image5.png"/>
+                    <pic:cNvPr id="0" name="image1.png"/>
                     <pic:cNvPicPr preferRelativeResize="0"/>
                   </pic:nvPicPr>
                   <pic:blipFill>
-                    <a:blip r:embed="rId15"/>
+                    <a:blip r:embed="rId16"/>
                     <a:srcRect b="0" l="0" r="0" t="0"/>
                     <a:stretch>
                       <a:fillRect/>
@@ -7089,16 +7143,16 @@
             <wp:extent cx="3151145" cy="4657861"/>
             <wp:effectExtent b="0" l="0" r="0" t="0"/>
             <wp:wrapSquare wrapText="bothSides" distB="114300" distT="114300" distL="114300" distR="114300"/>
-            <wp:docPr id="9" name="image6.png"/>
+            <wp:docPr id="10" name="image4.png"/>
             <a:graphic>
               <a:graphicData uri="http://schemas.openxmlformats.org/drawingml/2006/picture">
                 <pic:pic>
                   <pic:nvPicPr>
-                    <pic:cNvPr id="0" name="image6.png"/>
+                    <pic:cNvPr id="0" name="image4.png"/>
                     <pic:cNvPicPr preferRelativeResize="0"/>
                   </pic:nvPicPr>
                   <pic:blipFill>
-                    <a:blip r:embed="rId16"/>
+                    <a:blip r:embed="rId17"/>
                     <a:srcRect b="0" l="0" r="0" t="0"/>
                     <a:stretch>
                       <a:fillRect/>

</xml_diff>